<commit_message>
charging recommendation paper written on Latex
</commit_message>
<xml_diff>
--- a/Implementation/New2 ( with charging staton )/Updated Road Network/MOD25 - CS Recommendation/Backup/Paper Work/IEEE_EV_Charging_Recommendation.docx
+++ b/Implementation/New2 ( with charging staton )/Updated Road Network/MOD25 - CS Recommendation/Backup/Paper Work/IEEE_EV_Charging_Recommendation.docx
@@ -2008,7 +2008,7 @@
         <w:jc w:val="both"/>
       </w:pPr>
       <w:r>
-        <w:t>Ten charging stations are embedded as SUMO parking areas across five road corridors (bidirectional), each offering separate charging and waiting sub-areas. Charging sub-areas are equipped with SUMO charging device parameters (chargingPower, chargingEfficiency) enabling native SUMO battery replenishment. Table II details the configuration. Total system capacity comprises 62 charging slots and 49 waiting slots. Station power ratings range from 25–50 kW at 95% efficiency.</w:t>
+        <w:t>10 charging stations are implanted as simulation parking areas over 2-way, 5-road corridors. Each of them has separate charging sub areas and waiting sub areas. The charging sub areas have SUMO charging device parameters like-charging power, efficiency of charging. They enable local SUMO battery rechargeable. Table II explains detailed configuration. Here the total system capacity is 62 charging slots and 49-waiting slots. Station power rating range is : 25-50 kW with 95% efficiency.</w:t>
       </w:r>
     </w:p>
     <w:p>
@@ -3148,8 +3148,44 @@
         <w:jc w:val="both"/>
       </w:pPr>
       <w:r>
-        <w:t>TraCI provides a socket-based API enabling per-step interaction with SUMO from Python. The controller retrieves battery parameters (device.battery.chargeLevel, device.battery.capacity, device.battery.totalEnergyConsumed), vehicle position, speed, current road ID, lane ID, and stop status at every integer second. It invokes traci.simulation.findRoute() to assess topological reachability—a critical step for the directional constraint—and traci.lane.getShape() to compute Euclidean station distances. Where rerouting is feasible and the vehicle's SoC falls below the 30% alert threshold, the controller calls traci.vehicle.setRoute() and traci.vehicle.setParkingAreaStop() to physically reroute the vehicle to its assigned parking area.</w:t>
-      </w:r>
+        <w:t xml:space="preserve">TraCI gives a socket based API. It interacts with SUMO and Python. In every integer second,  The controller gathers battery parameters </w:t>
+      </w:r>
+      <w:r>
+        <w:rPr>
+          <w:lang w:val="en"/>
+        </w:rPr>
+        <w:t>(device.battery.chargeLevel, device.battery.capacity, device.battery.totalEnergyConsumed), vehicle location, speed, current road ID, lane ID and stop status</w:t>
+      </w:r>
+      <w:r>
+        <w:rPr>
+          <w:lang w:val="en"/>
+        </w:rPr>
+        <w:t xml:space="preserve">. </w:t>
+      </w:r>
+      <w:r>
+        <w:rPr>
+          <w:lang w:val="en"/>
+        </w:rPr>
+        <w:t>It uses traci.simulation.findRoute() to evaluate topological reachability. This is an important step for directional constraints—and traci.lane.getShape() to calculate Euclidean station distances.</w:t>
+      </w:r>
+      <w:r>
+        <w:rPr>
+          <w:lang w:val="en"/>
+        </w:rPr>
+        <w:t xml:space="preserve"> Where a route change is possible and the vehicle’s SoC drops below the threshold value of 30% warning. The controller reroutes the vehicle to its assigned parki</w:t>
+      </w:r>
+      <w:r>
+        <w:rPr>
+          <w:lang w:val="en"/>
+        </w:rPr>
+        <w:t>ng area(used as charging area here) by calling traci.vehicle.setRoute() and traci.vehicle.setParkingAreaStop().</w:t>
+      </w:r>
+    </w:p>
+    <w:p>
+      <w:pPr>
+        <w:ind w:firstLine="288"/>
+        <w:jc w:val="both"/>
+      </w:pPr>
     </w:p>
     <w:p>
       <w:pPr>
@@ -3173,8 +3209,32 @@
         <w:jc w:val="both"/>
       </w:pPr>
       <w:r>
-        <w:t>Every recommendation event is logged as a 28-attribute CSV record: timestep, vehicle type, current edge, lane, speed, SoC, battery capacity, priority level, and full metadata for both the nearest and second-nearest stations (ID, distance, power rating, charging/waiting availability, occupancy rate), plus the recommended station name and textual reasoning string. The simulation generated 1,169 recommendation events. Additionally, a vehicle-centric ML-ready dataset captures 33,721 timestep-vehicle records with system-level features including total active vehicles, charging vehicles, average SoC, system power demand, and per-vehicle status and metrics.</w:t>
-      </w:r>
+        <w:t>Each recommendation event is logged as 28 attribute CSV record:- timestep, vehicle-type, current edge, lane, speed, SoC, battery capacity, priority level and full metadata (ID, distance, power rating, charging/waiting availability, occupancy rate) for both the nearest, 2</w:t>
+      </w:r>
+      <w:r>
+        <w:rPr>
+          <w:vertAlign w:val="superscript"/>
+        </w:rPr>
+        <w:t>nd</w:t>
+      </w:r>
+      <w:r>
+        <w:t xml:space="preserve"> nearest stations, plus textual reasoning string of the recommended station. </w:t>
+      </w:r>
+      <w:r>
+        <w:t>1,169 recommendation events are generated in the simulation. Moreover a vehicle-centric dataset contains 33,721 timestep vehicle records with system level features. It includes total active vehicles, charging vehicles, average SoC, system power demand, and per-vehicle status and metrics.</w:t>
+      </w:r>
+    </w:p>
+    <w:p>
+      <w:pPr>
+        <w:spacing w:before="160" w:after="80"/>
+        <w:jc w:val="center"/>
+        <w:rPr>
+          <w:b/>
+          <w:bCs/>
+          <w:sz w:val="22"/>
+          <w:szCs w:val="22"/>
+        </w:rPr>
+      </w:pPr>
     </w:p>
     <w:p>
       <w:pPr>
@@ -3213,7 +3273,7 @@
         <w:jc w:val="both"/>
       </w:pPr>
       <w:r>
-        <w:t>For a vehicle v requiring charging at simulation time t, the recommended station S* minimises a composite score over the set of N = 10 available stations:</w:t>
+        <w:t xml:space="preserve">At simulation time t, for a vehicle v requiring charging, the proposed station-S* reduces a composite score over the set of N=10 available stations : </w:t>
       </w:r>
     </w:p>
     <w:p>
@@ -3235,8 +3295,20 @@
         <w:jc w:val="both"/>
       </w:pPr>
       <w:r>
-        <w:t>where Dᵢ is the Euclidean distance from vehicle v to station sᵢ (m), Qᵢ is the number of vehicles currently in the waiting queue at sᵢ, and Lᵢ is the instantaneous charging power load at sᵢ (kW). Weighting factors w₁ = 0.5, w₂ = 0.3, w₃ = 0.2 were set to prioritise proximity while moderating congestion and load effects. The ranking is computed using Euclidean distance for computational efficiency at each 1-second polling interval; the top two candidates (nearest and second-nearest) then pass through the decision logic below.</w:t>
-      </w:r>
+        <w:t>Where, Dᵢ = Euclidean distance from vehicle v to station sᵢ (m), Qᵢ = number of vehicles currently in the waiting queue at sᵢ, and Lᵢ = instant charging power load at sᵢ (kW). Weighting factors w₁ = 0.5, w₂ = 0.3, w₃ = 0.2 were set to prioritise proximity while moderating congestion and load effects.</w:t>
+      </w:r>
+      <w:r>
+        <w:t xml:space="preserve"> Rankings are calculated using Euclidean distance for computational efficiency at every 1 second polling interval. The top two candidates (closest and second-closest). Then go through the decision logic below</w:t>
+      </w:r>
+      <w:r>
+        <w:t>.</w:t>
+      </w:r>
+    </w:p>
+    <w:p>
+      <w:pPr>
+        <w:ind w:firstLine="288"/>
+        <w:jc w:val="both"/>
+      </w:pPr>
     </w:p>
     <w:p>
       <w:pPr>
@@ -3260,8 +3332,38 @@
         <w:jc w:val="both"/>
       </w:pPr>
       <w:r>
-        <w:t>Each recommendation event is tagged with one of three priority levels based on the vehicle's current SoC: CRITICAL (SoC &lt; 20%), HIGH (20% ≤ SoC &lt; 30%), and MEDIUM (30% ≤ SoC &lt; 50%). Priority-level tagging serves dual purposes: it modulates the urgency of console alerts during simulation (CRITICAL and HIGH events trigger verbose output) and constitutes a key feature in the generated ML dataset. The inspiration for explicit priority classification derives from Halder et al.'s energy demand score [7], which similarly quantifies urgency to enable intelligent resource prioritisation.</w:t>
-      </w:r>
+        <w:t>E</w:t>
+      </w:r>
+      <w:r>
+        <w:t>very</w:t>
+      </w:r>
+      <w:r>
+        <w:t xml:space="preserve"> recommendation event is tagged with one of </w:t>
+      </w:r>
+      <w:r>
+        <w:t xml:space="preserve">3 </w:t>
+      </w:r>
+      <w:r>
+        <w:t>priority levels based on the vehicle's current SoC: CRITICAL (SoC &lt; 20%), HIGH (20% ≤ SoC &lt; 30%), and MEDIUM (30% ≤ SoC &lt; 50%).</w:t>
+      </w:r>
+      <w:r>
+        <w:t xml:space="preserve"> Priority-level tagging serves a signifant purpose. it controls the urgency of console alerts during simulation (CRITICAL and HIGH events</w:t>
+      </w:r>
+      <w:r>
+        <w:t xml:space="preserve"> </w:t>
+      </w:r>
+      <w:r>
+        <w:t>trigger verbose output).</w:t>
+      </w:r>
+      <w:r>
+        <w:t xml:space="preserve"> </w:t>
+      </w:r>
+    </w:p>
+    <w:p>
+      <w:pPr>
+        <w:ind w:firstLine="288"/>
+        <w:jc w:val="both"/>
+      </w:pPr>
     </w:p>
     <w:p>
       <w:pPr>
@@ -3285,7 +3387,16 @@
         <w:jc w:val="both"/>
       </w:pPr>
       <w:r>
-        <w:t>A defining novelty of this framework is its explicit handling of SUMO's directional routing constraint. Easy Bikes and E-Rickshaws in Khulna operate on fixed corridor routes; SUMO enforces uni-directional lane assignments and cannot teleport vehicles to reverse edges. Consequently, the framework operates in two modes:</w:t>
+        <w:t>A notable innovation of this framework is SUMO's explicit handling of directional routing constraints. In Khulna, easy bikes and e-rickshaws operate on specific corridor routes</w:t>
+      </w:r>
+      <w:r>
+        <w:t>.</w:t>
+      </w:r>
+      <w:r>
+        <w:t xml:space="preserve"> SUMO enforces one-way lane assignments and cannot teleport vehicles to the opposite end. As a result, the framework operates in two modes</w:t>
+      </w:r>
+      <w:r>
+        <w:t>:</w:t>
       </w:r>
     </w:p>
     <w:p>
@@ -3301,7 +3412,7 @@
         <w:t xml:space="preserve">Rerouting Mode: </w:t>
       </w:r>
       <w:r>
-        <w:t>When traci.simulation.findRoute() returns a valid directed path from the vehicle's current edge to the target station's edge with positive route length, the framework calls setRoute() and setParkingAreaStop() to physically redirect the vehicle. A return route to the vehicle's original destination is appended when feasible.</w:t>
+        <w:t>When, traci.simulation.findRoute() - returns a valid directed path from the vehicle's current end to the target station end, with a positive route length, the framework calls setRoute() and setParkingAreaStop() to redirect the vehicle. A return route to the vehicle's original destination is added if possible.</w:t>
       </w:r>
     </w:p>
     <w:p>
@@ -3317,8 +3428,23 @@
         <w:t xml:space="preserve">Advisory Mode: </w:t>
       </w:r>
       <w:r>
-        <w:t>When no valid directed path exists—because the target station lies on an unreachable edge relative to the vehicle's current trajectory—the framework logs the best scoring station as an advisory recommendation without modifying the vehicle's route. This preserves simulation integrity and generates actionable data for a real-world notification system without forcing physically impossible manoeuvres.</w:t>
-      </w:r>
+        <w:t>W</w:t>
+      </w:r>
+      <w:r>
+        <w:t>hen no valid guided path exists, because of the target station is at an unreachable distance from the vehicle’s recent running-structure, the framework logs the best scoring station as suggested recommendation</w:t>
+      </w:r>
+      <w:r>
+        <w:t>.</w:t>
+      </w:r>
+      <w:r>
+        <w:t xml:space="preserve"> It preserves simulation integrity and produces useful data for real-world notification systems. </w:t>
+      </w:r>
+    </w:p>
+    <w:p>
+      <w:pPr>
+        <w:spacing w:before="40" w:after="80"/>
+        <w:ind w:left="360"/>
+      </w:pPr>
     </w:p>
     <w:p>
       <w:pPr>
@@ -3342,7 +3468,34 @@
         <w:jc w:val="both"/>
       </w:pPr>
       <w:r>
-        <w:t>Given the nearest station s₁ and second-nearest s₂, the recommendation algorithm applies the following rules in sequence:</w:t>
+        <w:t>Given the nearest station s₁ and second</w:t>
+      </w:r>
+      <w:r>
+        <w:t xml:space="preserve"> </w:t>
+      </w:r>
+      <w:r>
+        <w:t xml:space="preserve">nearest </w:t>
+      </w:r>
+      <w:r>
+        <w:t xml:space="preserve">station </w:t>
+      </w:r>
+      <w:r>
+        <w:t>s₂</w:t>
+      </w:r>
+      <w:r>
+        <w:t>. T</w:t>
+      </w:r>
+      <w:r>
+        <w:t>he recommendation algorithm applies the following rules</w:t>
+      </w:r>
+      <w:r>
+        <w:t xml:space="preserve"> </w:t>
+      </w:r>
+      <w:r>
+        <w:t>sequentially</w:t>
+      </w:r>
+      <w:r>
+        <w:t>:</w:t>
       </w:r>
     </w:p>
     <w:p>
@@ -3387,8 +3540,47 @@
         <w:jc w:val="both"/>
       </w:pPr>
       <w:r>
-        <w:t>A 30-second per-vehicle cooldown prevents recommendation churn. Queue management employs FIFO promotion: when a charging vehicle departs, the next waiting vehicle is automatically promoted to a charging slot via traci.vehicle.resume() and a new setParkingAreaStop() call, maintaining orderly slot throughput without external intervention.</w:t>
-      </w:r>
+        <w:t>A 30 second cooldown per vehicle prevents recommendation changes. Queue management uses FIFO propagation:</w:t>
+      </w:r>
+      <w:r>
+        <w:t>-</w:t>
+      </w:r>
+      <w:r>
+        <w:t xml:space="preserve"> when a charging vehicle leaves, the next waiting </w:t>
+      </w:r>
+      <w:r>
+        <w:t>vehicle will</w:t>
+      </w:r>
+      <w:r>
+        <w:t xml:space="preserve"> automatically promoted to a charging slot via traci.vehicle.resume()</w:t>
+      </w:r>
+      <w:r>
+        <w:t xml:space="preserve"> and  </w:t>
+      </w:r>
+      <w:r>
+        <w:t>new setParkingAreaStop() call</w:t>
+      </w:r>
+      <w:r>
+        <w:t>. That</w:t>
+      </w:r>
+      <w:r>
+        <w:t xml:space="preserve"> maintains orderly slot throughput without</w:t>
+      </w:r>
+      <w:r>
+        <w:t xml:space="preserve"> </w:t>
+      </w:r>
+      <w:r>
+        <w:t>outside interference</w:t>
+      </w:r>
+      <w:r>
+        <w:t>.</w:t>
+      </w:r>
+    </w:p>
+    <w:p>
+      <w:pPr>
+        <w:ind w:firstLine="288"/>
+        <w:jc w:val="both"/>
+      </w:pPr>
     </w:p>
     <w:p>
       <w:pPr>
@@ -3402,6 +3594,7 @@
           <w:sz w:val="22"/>
           <w:szCs w:val="22"/>
         </w:rPr>
+        <w:lastRenderedPageBreak/>
         <w:t>V.  SIMULATION SETUP AND PARAMETERS</w:t>
       </w:r>
     </w:p>
@@ -3411,8 +3604,37 @@
         <w:jc w:val="both"/>
       </w:pPr>
       <w:r>
-        <w:lastRenderedPageBreak/>
-        <w:t>Table III summarises the complete simulation parameter set. The SUMO configuration (Test1.sumocfg) specifies the road network (Test1_with_TLS.net.xml), vehicle flows (Test1.rou.xml), and charging infrastructure (Test1.chargingstations.add.xml). Battery output, charging station output, trip information, and summary statistics are collected via SUMO's native output facility. The Python controller (SmartChargingStationMonitor) connects via TraCI, iterates at 1-second integer steps, and exports recommendations and ML-ready datasets to timestamped CSV files upon simulation completion at t = 600 s.</w:t>
+        <w:t xml:space="preserve">Table III </w:t>
+      </w:r>
+      <w:r>
+        <w:t>summarizes</w:t>
+      </w:r>
+      <w:r>
+        <w:t xml:space="preserve"> the complete simulation parameter set.</w:t>
+      </w:r>
+      <w:r>
+        <w:t xml:space="preserve"> Test1.sumocfg</w:t>
+      </w:r>
+      <w:r>
+        <w:t xml:space="preserve"> (</w:t>
+      </w:r>
+      <w:r>
+        <w:t>SUMO configuration</w:t>
+      </w:r>
+      <w:r>
+        <w:t>) specifies the road network (Test1_with_TLS.net.xml), vehicle flows (Test1.rou.xml) and charging infrastructure (Test1.chargingstations.add.xml). Battery output, charging station output, trip information</w:t>
+      </w:r>
+      <w:r>
+        <w:t xml:space="preserve"> </w:t>
+      </w:r>
+      <w:r>
+        <w:t>and summary statistics are collected via SUMO's native output facility.</w:t>
+      </w:r>
+      <w:r>
+        <w:t xml:space="preserve"> The Python controller (charging_recommendation) connects through TraCI, iterates in 1-second integer steps, and exports recommendations datasets to timestamped CSV files after simulation completion at t = 600 seconds</w:t>
+      </w:r>
+      <w:r>
+        <w:t>.</w:t>
       </w:r>
     </w:p>
     <w:p>
@@ -4899,8 +5121,23 @@
         <w:jc w:val="both"/>
       </w:pPr>
       <w:r>
-        <w:t>The simulation concluded at t = 600 s, generating 33,721 vehicle-centric records (one per vehicle per second) and 1,169 charging recommendation events. The system recorded a peak instantaneous charging power of 1,370 kW with 40 vehicles simultaneously charging—reflecting near-saturation of the available 62 charging slots during peak demand periods. Average charging power across the simulation was 963.7 kW, and the total energy consumed for charging was 127.5 kWh. These load metrics demonstrate that the network experiences significant charging demand, making intelligent station selection essential to prevent localised transformer overload.</w:t>
-      </w:r>
+        <w:t>The</w:t>
+      </w:r>
+      <w:r>
+        <w:t xml:space="preserve"> simulation ended at 600 s</w:t>
+      </w:r>
+      <w:r>
+        <w:t>.</w:t>
+      </w:r>
+      <w:r>
+        <w:t xml:space="preserve"> It generates 33,721 vehicle centric records(one vehicle per second) and 1,169 charging recommendation events. The system recorded a peak instant charging power of 1,370 kW with 40 vehicles charging concurrently. That reflects near saturation of the 62 available charging areas during peak demand time. Across the simulation the average charging power was 963.7 kW, the total energy consumption for charging was 127.5 kWh. These load metrics highlights that there is an important charging demand on the network. It makes intelligent station selection essential to prevent local transformer overload.</w:t>
+      </w:r>
+    </w:p>
+    <w:p>
+      <w:pPr>
+        <w:ind w:firstLine="288"/>
+        <w:jc w:val="both"/>
+      </w:pPr>
     </w:p>
     <w:p>
       <w:pPr>
@@ -4924,7 +5161,67 @@
         <w:jc w:val="both"/>
       </w:pPr>
       <w:r>
-        <w:t>Table IV reports the priority-level breakdown of the 1,169 recommendation events. HIGH-priority events (SoC 20%–30%) dominated at 42.7%, followed by MEDIUM (34.6%) and CRITICAL (22.7%). The mean SoC at recommendation time was 27.7% (σ = 8.5%), with a minimum of 12.0% and a maximum of 46.5%, confirming that the 50% trigger activates recommendations with sufficient battery margin. The mean Euclidean distance to the nearest station at recommendation time was 84.3 m (σ = 62.0 m, min = 0.5 m, max = 256.6 m), indicating adequate station density for the modelled fleet.</w:t>
+        <w:t xml:space="preserve">Table IV </w:t>
+      </w:r>
+      <w:r>
+        <w:t>shows</w:t>
+      </w:r>
+      <w:r>
+        <w:t xml:space="preserve"> the priority</w:t>
+      </w:r>
+      <w:r>
+        <w:t xml:space="preserve"> </w:t>
+      </w:r>
+      <w:r>
+        <w:t>level breakdown of the 1,169 recommendation events. HIGH-priority events (SoC 20%–30%) dominated at 42.7%, followed by MEDIUM (34.6%) and CRITICAL (22.7%). The</w:t>
+      </w:r>
+      <w:r>
+        <w:t xml:space="preserve"> average</w:t>
+      </w:r>
+      <w:r>
+        <w:t xml:space="preserve"> SoC at </w:t>
+      </w:r>
+      <w:r>
+        <w:t xml:space="preserve">the time of </w:t>
+      </w:r>
+      <w:r>
+        <w:t>recommendation was 27.7% (σ = 8.5%), with a minimum of 12.0% and a maximum of 46.5%</w:t>
+      </w:r>
+      <w:r>
+        <w:t>. It</w:t>
+      </w:r>
+      <w:r>
+        <w:t xml:space="preserve"> </w:t>
+      </w:r>
+      <w:r>
+        <w:t xml:space="preserve">ensures </w:t>
+      </w:r>
+      <w:r>
+        <w:t>that the 50% trigger activates recommendations with sufficient battery margin. The</w:t>
+      </w:r>
+      <w:r>
+        <w:t xml:space="preserve"> average</w:t>
+      </w:r>
+      <w:r>
+        <w:t xml:space="preserve"> Euclidean distance to the nearest station at</w:t>
+      </w:r>
+      <w:r>
+        <w:t xml:space="preserve"> the time of</w:t>
+      </w:r>
+      <w:r>
+        <w:t xml:space="preserve"> recommendation was 84.3 m (σ = 62.0 m, min = 0.5 m, max = 256.6 m)</w:t>
+      </w:r>
+      <w:r>
+        <w:t>. It</w:t>
+      </w:r>
+      <w:r>
+        <w:t xml:space="preserve"> </w:t>
+      </w:r>
+      <w:r>
+        <w:t xml:space="preserve">is </w:t>
+      </w:r>
+      <w:r>
+        <w:t>indicating adequate station density for the modelled fleet.</w:t>
       </w:r>
     </w:p>
     <w:p>
@@ -5013,6 +5310,7 @@
                 <w:sz w:val="18"/>
                 <w:szCs w:val="18"/>
               </w:rPr>
+              <w:lastRenderedPageBreak/>
               <w:t>Priority</w:t>
             </w:r>
           </w:p>
@@ -5258,7 +5556,6 @@
                 <w:sz w:val="18"/>
                 <w:szCs w:val="18"/>
               </w:rPr>
-              <w:lastRenderedPageBreak/>
               <w:t>HIGH</w:t>
             </w:r>
           </w:p>
@@ -5621,7 +5918,61 @@
         <w:jc w:val="both"/>
       </w:pPr>
       <w:r>
-        <w:t>Table V presents the distribution of recommendation outcomes. The dominant outcome—59.0% (689 events)—was routing to the nearest station when charging slots were available. In 24.1% of cases (282 events), the nearest station was fully occupied and vehicles were successfully directed to the second-nearest station with available capacity, demonstrating genuine load diversion. Waiting slot overflow management handled 7.7% (90 events), while 9.2% (108 events) triggered Advisory Mode where both stations were saturated.</w:t>
+        <w:t xml:space="preserve">Table V </w:t>
+      </w:r>
+      <w:r>
+        <w:t>show</w:t>
+      </w:r>
+      <w:r>
+        <w:t>s the distribution of</w:t>
+      </w:r>
+      <w:r>
+        <w:t xml:space="preserve"> the results of</w:t>
+      </w:r>
+      <w:r>
+        <w:t xml:space="preserve"> recommendation</w:t>
+      </w:r>
+      <w:r>
+        <w:t>s</w:t>
+      </w:r>
+      <w:r>
+        <w:t>. The</w:t>
+      </w:r>
+      <w:r>
+        <w:t xml:space="preserve"> main result </w:t>
+      </w:r>
+      <w:r>
+        <w:t>—</w:t>
+      </w:r>
+      <w:r>
+        <w:t xml:space="preserve"> when charging slots were available, </w:t>
+      </w:r>
+      <w:r>
+        <w:t>59.0% (689 events)—was routing to the nearest station. In 24.1% of cases (282 events), the nearest station was fully occupied and vehicles were successfully directed to the second</w:t>
+      </w:r>
+      <w:r>
+        <w:t xml:space="preserve"> </w:t>
+      </w:r>
+      <w:r>
+        <w:t>nearest station with available capacity</w:t>
+      </w:r>
+      <w:r>
+        <w:t>. It</w:t>
+      </w:r>
+      <w:r>
+        <w:t xml:space="preserve"> </w:t>
+      </w:r>
+      <w:r>
+        <w:t xml:space="preserve">is </w:t>
+      </w:r>
+      <w:r>
+        <w:t>demonstrating genuine load diversion.</w:t>
+      </w:r>
+      <w:r>
+        <w:t xml:space="preserve"> Where both stations were saturated,</w:t>
+      </w:r>
+      <w:r>
+        <w:t xml:space="preserve"> Waiting slot overflow management handled 7.7% (90 events), while 9.2% (108 events) triggered Advisory Mode.</w:t>
       </w:r>
     </w:p>
     <w:p>
@@ -6162,7 +6513,52 @@
         <w:jc w:val="both"/>
       </w:pPr>
       <w:r>
-        <w:t>Station pa_8 received the highest recommendation share (32.4% of all events), reflecting its large slot capacity (5 charging + 3 waiting forward, 10 + 6 reverse) and up to 50 kW power rating combined with a central network position. Stations pa_7 and pa_3_rev ranked second and third at 14.7% and 14.0% respectively. Critically, all ten stations received at least 1.5% of recommendations, confirming that the multi-criteria scoring model distributes demand broadly.</w:t>
+        <w:t>Station pa_8 received the highest recommendation share (32.4% of all events)</w:t>
+      </w:r>
+      <w:r>
+        <w:t>. Which</w:t>
+      </w:r>
+      <w:r>
+        <w:t xml:space="preserve"> reflect</w:t>
+      </w:r>
+      <w:r>
+        <w:t>s</w:t>
+      </w:r>
+      <w:r>
+        <w:t xml:space="preserve"> its large slot capacity (5 charging + 3 waiting forward, 10 + 6 reverse) and </w:t>
+      </w:r>
+      <w:r>
+        <w:t xml:space="preserve">power rating </w:t>
+      </w:r>
+      <w:r>
+        <w:t>up to 50 kW combined with a central network position. Stations pa_7 and pa_3_rev</w:t>
+      </w:r>
+      <w:r>
+        <w:t xml:space="preserve"> came in</w:t>
+      </w:r>
+      <w:r>
+        <w:t xml:space="preserve"> second and third </w:t>
+      </w:r>
+      <w:r>
+        <w:t xml:space="preserve">with </w:t>
+      </w:r>
+      <w:r>
+        <w:t>14.7% and 14.0% respectively.</w:t>
+      </w:r>
+      <w:r>
+        <w:t xml:space="preserve"> Significantly,</w:t>
+      </w:r>
+      <w:r>
+        <w:t xml:space="preserve"> all ten stations received at least 1.5% of recommendations, confirming that the multi-criteria scoring model</w:t>
+      </w:r>
+      <w:r>
+        <w:t xml:space="preserve"> widely</w:t>
+      </w:r>
+      <w:r>
+        <w:t xml:space="preserve"> distributes demand </w:t>
+      </w:r>
+      <w:r>
+        <w:t>.</w:t>
       </w:r>
     </w:p>
     <w:p>
@@ -6187,7 +6583,31 @@
         <w:jc w:val="both"/>
       </w:pPr>
       <w:r>
-        <w:t>To quantify the framework's benefit, we define a nearest-only baseline that always recommends the Euclidean nearest station without considering occupancy, queue, or load. Table VI reports four performance metrics computed from the 1,169-event dataset.</w:t>
+        <w:t>To</w:t>
+      </w:r>
+      <w:r>
+        <w:t xml:space="preserve"> measure </w:t>
+      </w:r>
+      <w:r>
+        <w:t xml:space="preserve">the </w:t>
+      </w:r>
+      <w:r>
+        <w:t>benefit of the structure</w:t>
+      </w:r>
+      <w:r>
+        <w:t>, we define a nearest-only baseline that always recommends the Euclidean nearest station without considering occupancy, queue, or load. Table VI</w:t>
+      </w:r>
+      <w:r>
+        <w:t xml:space="preserve"> shows</w:t>
+      </w:r>
+      <w:r>
+        <w:t xml:space="preserve"> </w:t>
+      </w:r>
+      <w:r>
+        <w:t>4-</w:t>
+      </w:r>
+      <w:r>
+        <w:t>performance metrics computed from the 1,169-event dataset.</w:t>
       </w:r>
     </w:p>
     <w:p>
@@ -6867,7 +7287,49 @@
         <w:jc w:val="both"/>
       </w:pPr>
       <w:r>
-        <w:t>The Feasible Recommendation Rate (FRR) measures the fraction of events where the recommended station had at least one slot available. The proposed framework achieves FRR = 90.1% versus 66.0% for the baseline—a 24.0 pp improvement—because it evaluates occupancy and diverts vehicles to alternatives. The Congestion Avoidance Rate (CAR) measures diversion away from a congested nearest station; the baseline achieves CAR = 0% while the proposed achieves CAR = 37.1%, quantifying load-balancing contribution.</w:t>
+        <w:t>The Feasible Recommendation Rate (FRR)</w:t>
+      </w:r>
+      <w:r>
+        <w:t xml:space="preserve"> calculates</w:t>
+      </w:r>
+      <w:r>
+        <w:t xml:space="preserve"> the events </w:t>
+      </w:r>
+      <w:r>
+        <w:t xml:space="preserve">fraction </w:t>
+      </w:r>
+      <w:r>
+        <w:t>where the recommended station had at least one</w:t>
+      </w:r>
+      <w:r>
+        <w:t xml:space="preserve"> empty at proposed station</w:t>
+      </w:r>
+      <w:r>
+        <w:t xml:space="preserve">. The proposed framework achieves FRR = 90.1% </w:t>
+      </w:r>
+      <w:r>
+        <w:t xml:space="preserve">for the baseline </w:t>
+      </w:r>
+      <w:r>
+        <w:t>versus 66.0%—a 24.0 pp improvement—because it</w:t>
+      </w:r>
+      <w:r>
+        <w:t xml:space="preserve"> assesses</w:t>
+      </w:r>
+      <w:r>
+        <w:t xml:space="preserve"> occupancy and diverts vehicles to alternatives. The Congestion Avoidance Rate (CAR) measures diversion away from a congested nearest station; the baseline</w:t>
+      </w:r>
+      <w:r>
+        <w:t xml:space="preserve"> gains</w:t>
+      </w:r>
+      <w:r>
+        <w:t xml:space="preserve"> CAR = 0% while the proposed achieves CAR = 37.1%, </w:t>
+      </w:r>
+      <w:r>
+        <w:t xml:space="preserve">which </w:t>
+      </w:r>
+      <w:r>
+        <w:t>quantifying load-balancing contribution.</w:t>
       </w:r>
     </w:p>
     <w:p>
@@ -6876,7 +7338,43 @@
         <w:jc w:val="both"/>
       </w:pPr>
       <w:r>
-        <w:t>The High-Priority Smart Decision Rate (HPSDR) measures the fraction of CRITICAL- or HIGH-priority events (SoC &lt; 30%) where the framework diverted the vehicle to a second-nearest station with better availability. The proposed framework achieves HPSDR = 27.9% (vs. 0%), demonstrating intelligent routing when battery urgency is highest.</w:t>
+        <w:t>High-Priority Smart Decision Rate (HPSDR) measures the fraction of CRITICAL</w:t>
+      </w:r>
+      <w:r>
+        <w:t xml:space="preserve"> </w:t>
+      </w:r>
+      <w:r>
+        <w:t>- or HIGH</w:t>
+      </w:r>
+      <w:r>
+        <w:t xml:space="preserve"> </w:t>
+      </w:r>
+      <w:r>
+        <w:t xml:space="preserve">priority events (SoC &lt; </w:t>
+      </w:r>
+      <w:r>
+        <w:t xml:space="preserve"> </w:t>
+      </w:r>
+      <w:r>
+        <w:t>30%) where the framework divert</w:t>
+      </w:r>
+      <w:r>
+        <w:t>s</w:t>
+      </w:r>
+      <w:r>
+        <w:t xml:space="preserve"> the vehicle to a second</w:t>
+      </w:r>
+      <w:r>
+        <w:t xml:space="preserve"> closest </w:t>
+      </w:r>
+      <w:r>
+        <w:t>station with better availability. The proposed framework achieves HPSDR = 27.9% (vs. 0%), demonstrating intelligent routing wh</w:t>
+      </w:r>
+      <w:r>
+        <w:t>ile,</w:t>
+      </w:r>
+      <w:r>
+        <w:t xml:space="preserve"> battery urgency is highest.</w:t>
       </w:r>
     </w:p>
     <w:p>
@@ -6885,7 +7383,7 @@
         <w:jc w:val="both"/>
       </w:pPr>
       <w:r>
-        <w:t>Average distance increases from 84.3 m to 100.1 m (+15.8 m)—an accepted trade-off for directing vehicles to stations with capacity. This distance increase is negligible given the remaining range at median SoC of 27.7%.</w:t>
+        <w:t>The average distance grows from 84.3 m to 100.1 m (+15.8 m)—a recognized trade-off for operating vehicles to a capable stations. That distance increase is negligible given the remaining range at an average SoC of 27.7%.</w:t>
       </w:r>
     </w:p>
     <w:p>
@@ -6910,7 +7408,68 @@
         <w:jc w:val="both"/>
       </w:pPr>
       <w:r>
-        <w:t>The 600-second simulation window covers a simplified network. Full-scale deployment requires GPS-trace calibrated OD matrices and heterogeneous charging profiles from field surveys. The Advisory Mode (9.2% of events) could be reduced by increasing station density or adding a third-nearest candidate. Future work will integrate dynamic electricity pricing and renewable energy at station nodes.</w:t>
+        <w:t>The 600-second simulation window</w:t>
+      </w:r>
+      <w:r>
+        <w:t xml:space="preserve"> incorporates</w:t>
+      </w:r>
+      <w:r>
+        <w:t xml:space="preserve"> a simpl</w:t>
+      </w:r>
+      <w:r>
+        <w:t>e</w:t>
+      </w:r>
+      <w:r>
+        <w:t xml:space="preserve"> network. Full</w:t>
+      </w:r>
+      <w:r>
+        <w:t xml:space="preserve"> </w:t>
+      </w:r>
+      <w:r>
+        <w:t>scale deployment requires GPS</w:t>
+      </w:r>
+      <w:r>
+        <w:t xml:space="preserve"> </w:t>
+      </w:r>
+      <w:r>
+        <w:t>trace calibrated OD matrices and</w:t>
+      </w:r>
+      <w:r>
+        <w:t xml:space="preserve"> different</w:t>
+      </w:r>
+      <w:r>
+        <w:t xml:space="preserve"> charging profiles from field surveys. Advisory Mode (9.2% of</w:t>
+      </w:r>
+      <w:r>
+        <w:t xml:space="preserve"> occurrences</w:t>
+      </w:r>
+      <w:r>
+        <w:t xml:space="preserve">) </w:t>
+      </w:r>
+      <w:r>
+        <w:t xml:space="preserve">can </w:t>
+      </w:r>
+      <w:r>
+        <w:t xml:space="preserve">be reduced by increasing </w:t>
+      </w:r>
+      <w:r>
+        <w:lastRenderedPageBreak/>
+        <w:t xml:space="preserve">station density or adding a </w:t>
+      </w:r>
+      <w:r>
+        <w:t xml:space="preserve"> 3</w:t>
+      </w:r>
+      <w:r>
+        <w:rPr>
+          <w:vertAlign w:val="superscript"/>
+        </w:rPr>
+        <w:t>rd</w:t>
+      </w:r>
+      <w:r>
+        <w:t xml:space="preserve"> </w:t>
+      </w:r>
+      <w:r>
+        <w:t>nearest candidate. Future work will integrate dynamic electricity pricing and renewable energy at station nodes.</w:t>
       </w:r>
     </w:p>
     <w:p>
@@ -6934,8 +7493,64 @@
         <w:jc w:val="both"/>
       </w:pPr>
       <w:r>
-        <w:lastRenderedPageBreak/>
-        <w:t>The 37.1% Congestion Avoidance Rate implies that roughly one in three charging events that would otherwise overload a popular station can be redistributed—reducing peak transformer loading and extending equipment lifespan. The generated datasets (33,721 vehicle-centric + 1,169 recommendation events) provide precisely the feature space required by DeepBoost [8] for day-ahead load forecasting.</w:t>
+        <w:t xml:space="preserve">The 37.1% Congestion Avoidance Rate </w:t>
+      </w:r>
+      <w:r>
+        <w:t xml:space="preserve">suggests </w:t>
+      </w:r>
+      <w:r>
+        <w:t xml:space="preserve">that </w:t>
+      </w:r>
+      <w:r>
+        <w:t xml:space="preserve">approximately </w:t>
+      </w:r>
+      <w:r>
+        <w:t>one in three charging events that would otherwise overload a popular station can be redistributed</w:t>
+      </w:r>
+      <w:r>
+        <w:t xml:space="preserve">. This can </w:t>
+      </w:r>
+      <w:r>
+        <w:t>reduc</w:t>
+      </w:r>
+      <w:r>
+        <w:t>e</w:t>
+      </w:r>
+      <w:r>
+        <w:t xml:space="preserve"> peak transformer loading and </w:t>
+      </w:r>
+      <w:r>
+        <w:t>increasing</w:t>
+      </w:r>
+      <w:r>
+        <w:t xml:space="preserve"> equipment </w:t>
+      </w:r>
+      <w:r>
+        <w:t>lifetime</w:t>
+      </w:r>
+      <w:r>
+        <w:t xml:space="preserve">. The </w:t>
+      </w:r>
+      <w:r>
+        <w:t>resulting</w:t>
+      </w:r>
+      <w:r>
+        <w:t xml:space="preserve"> datasets (33,721 vehicle-centric + 1,169 recommendation events)</w:t>
+      </w:r>
+      <w:r>
+        <w:t xml:space="preserve"> accurately</w:t>
+      </w:r>
+      <w:r>
+        <w:t xml:space="preserve"> provide</w:t>
+      </w:r>
+      <w:r>
+        <w:t xml:space="preserve">s </w:t>
+      </w:r>
+      <w:r>
+        <w:t>the feature space</w:t>
+      </w:r>
+      <w:r>
+        <w:t xml:space="preserve"> separated valued columns.</w:t>
       </w:r>
     </w:p>
     <w:p>
@@ -6944,7 +7559,43 @@
         <w:jc w:val="both"/>
       </w:pPr>
       <w:r>
-        <w:t>The per-station recommendation distribution reveals that pa_8 and pa_7 corridors absorb disproportionate demand—directly actionable information for capacity expansion. The open SUMO+Python architecture enables city planners to test alternative station placements by modifying the XML configuration without specialised optimisation expertise.</w:t>
+        <w:t>The per</w:t>
+      </w:r>
+      <w:r>
+        <w:t xml:space="preserve"> </w:t>
+      </w:r>
+      <w:r>
+        <w:t>station recommendation distribution reveals that pa_8 and pa_7 corridors absorb</w:t>
+      </w:r>
+      <w:r>
+        <w:t xml:space="preserve"> inconsistent</w:t>
+      </w:r>
+      <w:r>
+        <w:t xml:space="preserve"> demand</w:t>
+      </w:r>
+      <w:r>
+        <w:t xml:space="preserve">- which </w:t>
+      </w:r>
+      <w:r>
+        <w:t>directly actionable information for capacity</w:t>
+      </w:r>
+      <w:r>
+        <w:t xml:space="preserve"> increasing</w:t>
+      </w:r>
+      <w:r>
+        <w:t xml:space="preserve">. The open SUMO+Python architecture enables </w:t>
+      </w:r>
+      <w:r>
+        <w:t xml:space="preserve">urban or city </w:t>
+      </w:r>
+      <w:r>
+        <w:t xml:space="preserve">planners to test alternative station placements by modifying the XML configuration without specialised </w:t>
+      </w:r>
+      <w:r>
+        <w:t>optimization skills</w:t>
+      </w:r>
+      <w:r>
+        <w:t>.</w:t>
       </w:r>
     </w:p>
     <w:p>
@@ -6968,7 +7619,49 @@
         <w:jc w:val="both"/>
       </w:pPr>
       <w:r>
-        <w:t>This paper presented a SUMO+TraCI simulation-based charging station recommendation framework for Khulna city's heterogeneous EV fleet. A 100-flow simulation across three vehicle classes with varying battery capacities (12,000 Wh for Easy Bikes; 5,760–7,200 Wh for E-Rickshaws and E-Vans), eight routes, and ten bidirectional stations generated 1,169 recommendation events over 600 seconds, recording peak charging power of 1,370 kW with 40 vehicles simultaneously charging and consuming 127.5 kWh total energy.</w:t>
+        <w:t xml:space="preserve">This paper </w:t>
+      </w:r>
+      <w:r>
+        <w:t>shows</w:t>
+      </w:r>
+      <w:r>
+        <w:t xml:space="preserve"> a SUMO+TraCI simulation-based charging station recommendation framework for </w:t>
+      </w:r>
+      <w:r>
+        <w:t xml:space="preserve">heterogeneous EV fleet  in </w:t>
+      </w:r>
+      <w:r>
+        <w:t>Khulna city. A 100</w:t>
+      </w:r>
+      <w:r>
+        <w:t xml:space="preserve"> </w:t>
+      </w:r>
+      <w:r>
+        <w:t xml:space="preserve">flow simulation </w:t>
+      </w:r>
+      <w:r>
+        <w:t xml:space="preserve">through 3- </w:t>
+      </w:r>
+      <w:r>
+        <w:t>vehicle classes with varying battery capacities (12,000 Wh for Easy Bikes; 5,760–7,200 Wh for E-Rickshaws and E-Vans), eight routes</w:t>
+      </w:r>
+      <w:r>
+        <w:t xml:space="preserve"> </w:t>
+      </w:r>
+      <w:r>
+        <w:t>and ten bidirectional stations generated 1,169 recommendation events over 600 seconds</w:t>
+      </w:r>
+      <w:r>
+        <w:t>. Also depicts the</w:t>
+      </w:r>
+      <w:r>
+        <w:t xml:space="preserve"> record</w:t>
+      </w:r>
+      <w:r>
+        <w:t xml:space="preserve"> of</w:t>
+      </w:r>
+      <w:r>
+        <w:t xml:space="preserve"> peak charging power of 1,370 kW with 40 vehicles simultaneously charging and consuming 127.5 kWh total energy.</w:t>
       </w:r>
     </w:p>
     <w:p>
@@ -6977,7 +7670,25 @@
         <w:jc w:val="both"/>
       </w:pPr>
       <w:r>
-        <w:t>The principal contributions are: (1) a physics-calibrated SUMO fleet model with heterogeneous battery configurations across three vehicle classes; (2) a multi-criteria recommendation algorithm with Rerouting/Advisory duality; (3) comparative evaluation demonstrating +24.0 pp Feasible Recommendation Rate, +37.1 pp Congestion Avoidance Rate, and +27.9 pp High-Priority Smart Decision Rate versus a nearest-only baseline; and (4) two complementary datasets (33,721 vehicle-centric records + 1,169 recommendation events) directly compatible with ML load forecasting.</w:t>
+        <w:t>The</w:t>
+      </w:r>
+      <w:r>
+        <w:t xml:space="preserve"> main</w:t>
+      </w:r>
+      <w:r>
+        <w:t xml:space="preserve"> contributions are: (1) a physics-calibrated SUMO fleet model with</w:t>
+      </w:r>
+      <w:r>
+        <w:t xml:space="preserve"> different</w:t>
+      </w:r>
+      <w:r>
+        <w:t xml:space="preserve"> battery configurations across three vehicle classes; (2) a multi-criteria recommendation algorithm with Advisory duality; (3) comparative evaluation demonstrating +24.0 pp</w:t>
+      </w:r>
+      <w:r>
+        <w:t xml:space="preserve"> potential</w:t>
+      </w:r>
+      <w:r>
+        <w:t xml:space="preserve"> Recommendation Rate, +37.1 pp Congestion Avoidance Rate, and +27.9 pp High-Priority Smart Decision Rate versus a nearest-only baseline; and (4) two complementary datasets (33,721 vehicle-centric records + 1,169 recommendation events).</w:t>
       </w:r>
     </w:p>
     <w:p>
@@ -6986,7 +7697,25 @@
         <w:jc w:val="both"/>
       </w:pPr>
       <w:r>
-        <w:t>Future work will extend to Khulna's full road graph with GPS-trace calibration, incorporate dynamic pricing, model renewable energy at stations, and evaluate demand-response scheduling aligned with Bangladesh's National Energy Policy.</w:t>
+        <w:t>Future work will</w:t>
+      </w:r>
+      <w:r>
+        <w:t xml:space="preserve"> be expanded</w:t>
+      </w:r>
+      <w:r>
+        <w:t xml:space="preserve"> to</w:t>
+      </w:r>
+      <w:r>
+        <w:t xml:space="preserve"> include GPS trace calibration of the full road graph of</w:t>
+      </w:r>
+      <w:r>
+        <w:t xml:space="preserve"> Khulna, dynamic pricing, model renewable energy at stations and evaluate demand-response schedul</w:t>
+      </w:r>
+      <w:r>
+        <w:t>es consistent</w:t>
+      </w:r>
+      <w:r>
+        <w:t xml:space="preserve"> with Bangladesh's National Energy Policy.</w:t>
       </w:r>
     </w:p>
     <w:p>
@@ -7091,20 +7820,6 @@
           <w:szCs w:val="18"/>
         </w:rPr>
         <w:t>[6] A. Hussain, V. H. Bui, and H. M. Kim, "A multi-criteria decision-making approach for electric vehicle charging station location selection," Energies, vol. 13, no. 23, p. 6322, 2020.</w:t>
-      </w:r>
-    </w:p>
-    <w:p>
-      <w:pPr>
-        <w:spacing w:before="40" w:after="40" w:line="216" w:lineRule="auto"/>
-        <w:ind w:left="288" w:hanging="288"/>
-        <w:jc w:val="both"/>
-      </w:pPr>
-      <w:r>
-        <w:rPr>
-          <w:sz w:val="18"/>
-          <w:szCs w:val="18"/>
-        </w:rPr>
-        <w:t>[7] M. Halder, A. Adhikary, S.-B. Park, and C. S. Hong, "An artificial intelligence framework for dynamic selection and resource allocation for EVs in vehicular networks," in Proc. IEEE/IFIP NOMS 2024, Seoul, South Korea, May 2024, DOI: 10.1109/NOMS59830.2024.10574932.</w:t>
       </w:r>
     </w:p>
     <w:p>
@@ -7817,6 +8532,29 @@
       <w:szCs w:val="20"/>
     </w:rPr>
   </w:style>
+  <w:style w:type="paragraph" w:styleId="HTMLPreformatted">
+    <w:name w:val="HTML Preformatted"/>
+    <w:basedOn w:val="Normal"/>
+    <w:link w:val="HTMLPreformattedChar"/>
+    <w:uiPriority w:val="99"/>
+    <w:semiHidden/>
+    <w:unhideWhenUsed/>
+    <w:rsid w:val="001D18E7"/>
+    <w:rPr>
+      <w:rFonts w:ascii="Consolas" w:hAnsi="Consolas"/>
+    </w:rPr>
+  </w:style>
+  <w:style w:type="character" w:customStyle="1" w:styleId="HTMLPreformattedChar">
+    <w:name w:val="HTML Preformatted Char"/>
+    <w:basedOn w:val="DefaultParagraphFont"/>
+    <w:link w:val="HTMLPreformatted"/>
+    <w:uiPriority w:val="99"/>
+    <w:semiHidden/>
+    <w:rsid w:val="001D18E7"/>
+    <w:rPr>
+      <w:rFonts w:ascii="Consolas" w:hAnsi="Consolas"/>
+    </w:rPr>
+  </w:style>
 </w:styles>
 </file>
 

</xml_diff>